<commit_message>
Auto commit (2026-10-29 19:49) — 2 changes
Claude Code 세션 종료 시 자동 커밋.

Co-Authored-By: Claude <noreply@anthropic.com>
</commit_message>
<xml_diff>
--- a/projects/36_slave_dragon_king/노예라 불린 용의 공주_작가 무료회차 수정고(10.29·1-8화)_검토 보고서.docx
+++ b/projects/36_slave_dragon_king/노예라 불린 용의 공주_작가 무료회차 수정고(10.29·1-8화)_검토 보고서.docx
@@ -55,7 +55,7 @@
           <w:color w:val="1A1A1A"/>
           <w:sz w:val="21"/>
         </w:rPr>
-        <w:t>용어: 2.0 = 10월 13일 원고(1~8화) · 10.27 원고 = 지난번 수정고(1~9화) · 10.29 원고 = 이번 수정고 · 10-28 피드백 = 10월 28일 작가에게 보낸 피드백.</w:t>
+        <w:t>용어: 2.0 = 10월 13일 원고(1~8화) · 10.22 원고 = 10월 22일 무료회차 최종고(1~9화) · 10.27 원고 = 지난번 수정고(1~9화) · 10.29 원고 = 이번 수정고 · 10-28 피드백 = 10월 28일 작가에게 보낸 피드백.</w:t>
       </w:r>
     </w:p>
     <w:p>
@@ -216,7 +216,7 @@
           <w:color w:val="1A1A1A"/>
           <w:sz w:val="21"/>
         </w:rPr>
-        <w:t>· 빼면: 6화 전체와 7화 323줄, 8화 340~346줄을 다시 써야 한다. 8화에서 도미닉을 막는 사람이 다시 비는데, 10.27은 그 자리를 에드워드가 채웠다가 "18년 키운 동생 편에서 손바닥 뒤집듯 넘어간다"는 지적을 받았다.</w:t>
+        <w:t>· 빼면: 6화 전체와 7화 323줄, 8화 340~346줄을 다시 써야 한다. 8화에서 도미닉을 막는 사람이 다시 비는데, 10.22·10.27은 그 자리를 에드워드가 채웠고, 우리가 10월 23일 피드백에서 "18년 키운 동생 편에서 손바닥 뒤집듯 넘어간다"고 짚었다.</w:t>
       </w:r>
     </w:p>
     <w:p>
@@ -318,7 +318,7 @@
           <w:color w:val="1A1A1A"/>
           <w:sz w:val="21"/>
         </w:rPr>
-        <w:t>· "대사 턴이 왔다갔다하고 길다" → 같은 방식으로 세면 대사 한 줄 평균 24.6자 → 22.8자, 40자 넘는 줄 16개 → 9개, 바네사 속마음 11줄 → 6줄. 2화 사라·아이비 주고받기는 사라 대사 두 줄로 줄었다. 남은 것 = 5화 같은 말 두 번(1부 2).</w:t>
+        <w:t>· "대사 턴이 왔다갔다하고 길다" → 대사 줄만 글자 수로 세면(말투 지시 괄호 제외) 10.27 → 10.29에서 대사 한 줄 평균 24.6자 → 22.8자, 40자 넘는 줄 16개 → 9개, 바네사 속마음 11줄 → 6줄. 2화 사라·아이비 주고받기는 사라 대사 두 줄로 줄었다. 남은 것 = 5화 같은 말 두 번(1부 2).</w:t>
       </w:r>
     </w:p>
     <w:p>
@@ -362,7 +362,7 @@
           <w:color w:val="1A1A1A"/>
           <w:sz w:val="21"/>
         </w:rPr>
-        <w:t>· 5·6화 흰 용 사라짐 → 흰 용 동료가 원고에서 빠져(2화 아룡은 엎드리기만 하고 흰 용으로 변하지 않는다) 해당 없음.</w:t>
+        <w:t>· 5·6화 흰 용 사라짐 → 흰 용 동료가 원고에서 빠져(2화 아룡은 엎드리기만 하고 흰 용으로 변하지 않는다) 이 지적은 없어졌다.</w:t>
       </w:r>
     </w:p>
     <w:p>
@@ -422,7 +422,7 @@
           <w:color w:val="1A1A1A"/>
           <w:sz w:val="21"/>
         </w:rPr>
-        <w:t>· 인물 줄 아기 둘 → 고쳐짐. 004-1 에드워드 · 006-1 마부 · 008-1 에드워드 · 흰 용 → 장면이 바뀌어 해당 없음.</w:t>
+        <w:t>· 인물 줄 아기 둘 → 고쳐짐. 인물 줄 004-1 에드워드 · 006-1 마부 · 008-1 에드워드 · 흰 용 → 그 장면들이 2.0 모양으로 바뀌어 이 지적들은 없어졌다.</w:t>
       </w:r>
     </w:p>
     <w:p>
@@ -508,7 +508,7 @@
           <w:color w:val="1A1A1A"/>
           <w:sz w:val="21"/>
         </w:rPr>
-        <w:t>문제. 4화 끝(칼) · 7화 끝(「跪下！……像狗一样把这些垃圾吃掉！」) · 8화 끝(반지 + 흰 용 환영)은 다음 행동이 걸린 채 끊기는데, 5화와 6화만 행동 없이 닫힌다. 5화는 감상으로 끝나고, 6화의 다짐은 7화 첫 장면(아이비가 과일을 싸다 손목을 잡힘)에서 곧바로 실행돼서 끝 대사가 다음 화를 미리 말해 버린다. 10-28 피드백의 "클리프행어가 더 좋아졌는지 의아하다"가 가리킨 두 자리가 화 번호만 바뀌어 남았다.</w:t>
+        <w:t>문제. 4화 끝(칼) · 7화 끝(「跪下！……像狗一样把这些垃圾吃掉！」) · 8화 끝(반지 + 흰 용 환영)은 다음 행동이 걸린 채 끊기는데, 5화와 6화만 행동 없이 닫힌다. 5화는 감상으로 끝나고, 6화의 다짐은 7화 첫 장면(아이비가 과일을 싸다 손목을 잡힘)에서 곧바로 실행돼서 끝 대사가 다음 화를 미리 말해 버린다. 10-28 피드백의 "클리프행어가 더 좋아졌는지 의아하다"가 가리킨 10.27의 6화 끝과 7화 끝이, 화 번호만 하나씩 당겨져 그대로 남았다.</w:t>
       </w:r>
     </w:p>
     <w:p>
@@ -522,7 +522,7 @@
           <w:color w:val="1A1A1A"/>
           <w:sz w:val="21"/>
         </w:rPr>
-        <w:t>고칠 곳 — 6화: 7화 007-1의 첫 네 줄을 6화 끝으로 당긴다(씬 006-2 庆典宴会区로). 6화 마지막 줄이 바네사 대사가 되고, 7화는 「△艾薇身体一僵。周围宾客齐刷刷看来。」부터 시작한다.</w:t>
+        <w:t>고칠 곳 — 6화: 7화 007-1의 첫 다섯 줄을 7화에서 빼서 6화 끝에 붙인다(6화 두 번째 씬 006-2 庆典宴会区/日/外). 6화 마지막 줄이 바네사 대사가 되고, 7화는 「△艾薇身体一僵。周围宾客齐刷刷看来。」부터 시작한다.</w:t>
       </w:r>
     </w:p>
     <w:p>
@@ -683,7 +683,7 @@
           <w:color w:val="1A1A1A"/>
           <w:sz w:val="21"/>
         </w:rPr>
-        <w:t>· 바네사 속마음 「同一天生日？！凭什么这种卑贱的臭虫，能在时间上和高贵的我产生联系！」 바로 다음 줄이 소리 내 하는 「够了，你这泥种也配和我同一天生日？你以为你是谁！」다. 속으로 한 말을 곧장 입으로 한 번 더 한다. 속마음 줄 삭제.</w:t>
+        <w:t>· 바네사 속마음 「同一天生日？！凭什么这种卑贱的臭虫，能在时间上和高贵的我产生联系！」 바로 다음 줄이 소리 내 하는 「够了，你这泥种也配和我同一天生日？你以为你是谁！」다. 속으로 한 말을 곧장 입으로 한 번 더 한다. 바네사 VO 줄 삭제.</w:t>
       </w:r>
     </w:p>
     <w:p>
@@ -1002,7 +1002,7 @@
           <w:color w:val="1A1A1A"/>
           <w:sz w:val="21"/>
         </w:rPr>
-        <w:t>· 5화 005-2: 어린 에드워드가 때리는 사람은 「侍从」인데 엘레노어 대사는 「拒绝倾听她的真相」. 영어로 옮기면 남자 시종을 두고 her truth가 된다. 인물 줄과 지문의 「侍从」을 「侍女」로.</w:t>
+        <w:t>· 5화 005-2: 어린 에드워드가 때리는 사람은 「侍从」인데 엘레노어 대사는 「拒绝倾听她的真相」. 영어 더빙에선 남자 시종을 두고 her truth(그녀의 진실)라고 말하게 된다. 인물 줄과 지문의 「侍从」을 「侍女」로.</w:t>
       </w:r>
     </w:p>
     <w:p>
@@ -1091,7 +1091,7 @@
           <w:color w:val="1A1A1A"/>
           <w:sz w:val="21"/>
         </w:rPr>
-        <w:t>· 4화 004-1: 「你跟我谈权力？」 — 아이비가 말한 건 「没有权利」(권리). 말을 비튼 게 아니면 「你跟我谈权利？」로.</w:t>
+        <w:t>· 4화 004-1: 「你跟我谈权力？」 — 아이비가 말한 건 「没有权利」(권리). 일부러 말을 비튼 게 아니라면 오타이니 「你跟我谈权利？」로.</w:t>
       </w:r>
     </w:p>
     <w:p>

</xml_diff>

<commit_message>
Auto commit (2026-10-29 20:35) — 5 changes
Claude Code 세션 종료 시 자동 커밋.

Co-Authored-By: Claude <noreply@anthropic.com>
Claude-Session: https://claude.ai/code/e59849dc-4804-4008-9f10-fc8b3e590ac6
</commit_message>
<xml_diff>
--- a/projects/36_slave_dragon_king/노예라 불린 용의 공주_작가 무료회차 수정고(10.29·1-8화)_검토 보고서.docx
+++ b/projects/36_slave_dragon_king/노예라 불린 용의 공주_작가 무료회차 수정고(10.29·1-8화)_검토 보고서.docx
@@ -625,7 +625,7 @@
           <w:color w:val="1A1A1A"/>
           <w:sz w:val="21"/>
         </w:rPr>
-        <w:t>고칠 곳 — 5화(웨슬리를 살릴 때): 마지막 정지 컷 앞에 6화 첫 장면의 황금 용을 아이비 쪽에서 먼저 보여 준다.</w:t>
+        <w:t>고칠 곳 — 5화: 아이비 속마음 「……只是一句为了成全公主仁慈名声的借口……」 뒤, 정지 컷 앞에 한 줄.</w:t>
       </w:r>
     </w:p>
     <w:p>
@@ -640,7 +640,7 @@
           <w:color w:val="1A1A1A"/>
           <w:sz w:val="21"/>
         </w:rPr>
-        <w:t>· △天空传来一声龙啸。一头黄金巨龙从艾薇头顶掠过，朝庆典广场飞去。艾薇抬起头。</w:t>
+        <w:t>· △座驾上，爱德华忍不住回头，望向道路中央的艾薇。</w:t>
       </w:r>
     </w:p>
     <w:p>
@@ -654,7 +654,7 @@
           <w:color w:val="1A1A1A"/>
           <w:sz w:val="21"/>
         </w:rPr>
-        <w:t>6화 「一头黄金巨龙降落在广场中央」이 바로 이어진다. 바네사의 약혼자이자 아이비에게 끌릴 남자가 오는 순간에서 5화가 끊긴다.</w:t>
+        <w:t>아이비는 "핑계였구나" 하고 돌아서는데, 시청자는 그 핑계를 댄 에드워드가 뒤돌아보는 걸 본다. 인물 설정 에드워드 칸의 「屡次在艾薇身上看到已故母亲埃莉诺的影子」와 아이비 칸의 「与三位亲生哥哥之间对面不相识的虐心拉扯」가 5화 마지막 컷에 같이 걸린다.</w:t>
       </w:r>
     </w:p>
     <w:p>
@@ -768,7 +768,7 @@
           <w:color w:val="1A1A1A"/>
           <w:sz w:val="21"/>
         </w:rPr>
-        <w:t>장면. 7화 끝 「凡妮莎余光瞥见不远处的爱德华和韦斯利正看向这边」 — 에드워드는 몇 걸음 밖에서 보고 있다(이 줄은 10.29에 새로 생겼다. 2.0 7화엔 없었다). 8화는 바로 다음 순간인데, 도미닉이 아이비를 걷어차 무릎 꿇리고 바네사가 구두 굽으로 손을 짓이기는 동안 에드워드는 한 줄도 안 나온다. 웨슬리가 나섰다가 세바스찬에게 막힐 때도 마찬가지다.</w:t>
+        <w:t>장면. 7화 끝 「凡妮莎余光瞥见不远处的爱德华和韦斯利正看向这边」 — 에드워드는 몇 걸음 밖에서 보고 있다. 8화는 바로 다음 순간인데, 도미닉이 아이비를 걷어차 무릎 꿇리고 바네사가 구두 굽으로 손을 짓이기는 동안 에드워드는 한 줄도 안 나온다.</w:t>
       </w:r>
     </w:p>
     <w:p>
@@ -782,7 +782,7 @@
           <w:color w:val="1A1A1A"/>
           <w:sz w:val="21"/>
         </w:rPr>
-        <w:t>문제. 5화에서 어머니 얼굴을 겹쳐 보고 도미닉의 칼을 막은 사람이 8화에선 반응 컷 하나 없다. 인물 설정 에드워드 칸은 「甚至在艾薇受伤时，心脏会像被撕裂一样痛苦……强行压抑自己想要保护艾薇的本能」인데, 8화엔 누르는 모습도 나오지 않는다.</w:t>
+        <w:t>문제. 인물 설정 에드워드 칸은 「屡次在艾薇身上看到已故母亲埃莉诺的影子，甚至在艾薇受伤时，心脏会像被撕裂一样痛苦……强行压抑自己想要保护艾薇的本能」이다. 본문에서 이게 나오는 건 5화 한 번(「看到这个女孩受伤，我的心就像被撕裂一样！」 → 어머니 플래시백 → 도미닉을 말림)뿐이다. 8화는 아이비가 1~8화 중 가장 크게 다치는 자리인데, 바로 옆에 세워 둔 에드워드가 없다.</w:t>
       </w:r>
     </w:p>
     <w:p>
@@ -796,7 +796,7 @@
           <w:color w:val="1A1A1A"/>
           <w:sz w:val="21"/>
         </w:rPr>
-        <w:t>고칠 곳 — 지문 한 줄. 「△韦斯利停下脚步与塞巴斯蒂安对峙。气氛瞬间紧张。」 뒤에:</w:t>
+        <w:t>고칠 곳 — 지문 한 줄. 「△凡妮莎居高临下，用鞋跟用力碾压艾薇的手。」 뒤에:</w:t>
       </w:r>
     </w:p>
     <w:p>
@@ -811,7 +811,7 @@
           <w:color w:val="1A1A1A"/>
           <w:sz w:val="21"/>
         </w:rPr>
-        <w:t>· △不远处，爱德华攥紧拳头，脚步向前一动，又硬生生停住。</w:t>
+        <w:t>· △不远处，爱德华猛地按住胸口，脚步向前一动，又硬生生停住。</w:t>
       </w:r>
     </w:p>
     <w:p>
@@ -825,7 +825,7 @@
           <w:color w:val="1A1A1A"/>
           <w:sz w:val="21"/>
         </w:rPr>
-        <w:t>웨슬리가 막히는 순간 에드워드도 나서려다 스스로 멈춘다. 설정의 "본능을 억지로 누른다"가 화면에 한 번 나온다.</w:t>
+        <w:t>5화의 "가슴이 찢어진다"가 몸으로 한 번 더 나오고, 이번엔 말리지 못하고 스스로 멈춘다.</w:t>
       </w:r>
     </w:p>
     <w:p>

</xml_diff>